<commit_message>
Replace restricted Piper voices with public-domain ones.
Lessac, Alba, and Alan are gone. The shipped clips are LJ Speech, Norman, and Cori, each trained from scratch on a public-domain dataset. The footer panels stay clear of the bot, and the Level 03 worksheet no longer repeats its title as an orphan heading.

Co-authored-by: CYPHER0X9 <cipher0x9@users.noreply.github.com>
</commit_message>
<xml_diff>
--- a/downloads/modules/Python-Lab_Level-03_Functions-and-Scope_Worksheet.docx
+++ b/downloads/modules/Python-Lab_Level-03_Functions-and-Scope_Worksheet.docx
@@ -44,6 +44,8 @@
     <w:p>
       <w:pPr>
         <w:pStyle w:val="Title"/>
+        <w:keepNext/>
+        <w:keepLines/>
       </w:pPr>
       <w:r>
         <w:rPr>
@@ -80,6 +82,8 @@
     <w:p>
       <w:pPr>
         <w:pStyle w:val="Heading1"/>
+        <w:keepNext/>
+        <w:keepLines/>
       </w:pPr>
       <w:r>
         <w:rPr>
@@ -322,21 +326,9 @@
     <w:p/>
     <w:p>
       <w:pPr>
-        <w:pStyle w:val="Title"/>
-      </w:pPr>
-      <w:r>
-        <w:rPr>
-          <w:rFonts w:ascii="Calibri" w:hAnsi="Calibri" w:cs="Calibri"/>
-          <w:b/>
-          <w:color w:val="945E3A"/>
-          <w:sz w:val="52"/>
-        </w:rPr>
-        <w:t>Functions and Scope</w:t>
-      </w:r>
-    </w:p>
-    <w:p>
-      <w:pPr>
         <w:pStyle w:val="Heading1"/>
+        <w:keepNext/>
+        <w:keepLines/>
       </w:pPr>
       <w:r>
         <w:rPr>
@@ -362,6 +354,8 @@
     <w:p>
       <w:pPr>
         <w:pStyle w:val="Heading1"/>
+        <w:keepNext/>
+        <w:keepLines/>
       </w:pPr>
       <w:r>
         <w:rPr>
@@ -519,6 +513,8 @@
     <w:p>
       <w:pPr>
         <w:pStyle w:val="Heading1"/>
+        <w:keepNext/>
+        <w:keepLines/>
       </w:pPr>
       <w:r>
         <w:rPr>
@@ -649,6 +645,8 @@
     <w:p>
       <w:pPr>
         <w:pStyle w:val="Heading1"/>
+        <w:keepNext/>
+        <w:keepLines/>
       </w:pPr>
       <w:r>
         <w:rPr>
@@ -796,6 +794,8 @@
     <w:p>
       <w:pPr>
         <w:pStyle w:val="Heading1"/>
+        <w:keepNext/>
+        <w:keepLines/>
       </w:pPr>
       <w:r>
         <w:rPr>
@@ -952,6 +952,8 @@
     <w:p>
       <w:pPr>
         <w:pStyle w:val="Heading1"/>
+        <w:keepNext/>
+        <w:keepLines/>
       </w:pPr>
       <w:r>
         <w:rPr>
@@ -1084,6 +1086,8 @@
     <w:p>
       <w:pPr>
         <w:pStyle w:val="Heading1"/>
+        <w:keepNext/>
+        <w:keepLines/>
       </w:pPr>
       <w:r>
         <w:rPr>
@@ -1140,6 +1144,8 @@
     <w:p>
       <w:pPr>
         <w:pStyle w:val="Heading1"/>
+        <w:keepNext/>
+        <w:keepLines/>
       </w:pPr>
       <w:r>
         <w:rPr>
@@ -1165,6 +1171,8 @@
     <w:p>
       <w:pPr>
         <w:pStyle w:val="Heading1"/>
+        <w:keepNext/>
+        <w:keepLines/>
       </w:pPr>
       <w:r>
         <w:rPr>

</xml_diff>